<commit_message>
Partner proofreading snapshot 2026-10-05 / d510198180bd
</commit_message>
<xml_diff>
--- a/teacher_guides/es/scenario_bite_future_4-7_guide.docx
+++ b/teacher_guides/es/scenario_bite_future_4-7_guide.docx
@@ -127,7 +127,7 @@
                                 <w:sz w:val="32"/>
                                 <w:vertAlign w:val="baseline"/>
                               </w:rPr>
-                              <w:t xml:space="preserve">TITULO:  Una mordedura del futuro</w:t>
+                              <w:t xml:space="preserve">TÍTULO: Un bocado del futuro</w:t>
                             </w:r>
                           </w:p>
                           <w:p>
@@ -2072,7 +2072,7 @@
                       <w:szCs w:val="24"/>
                       <w:rtl w:val="0"/>
                     </w:rPr>
-                    <w:t xml:space="preserve">Versión impresa o digital de la historia de Farmer Ella y los Robot Helpers</w:t>
+                    <w:t xml:space="preserve">Versión impresa o digital del cuento «La granjera Ella y los robots ayudantes»</w:t>
                   </w:r>
                 </w:p>
                 <w:p>
@@ -2096,7 +2096,7 @@
                       <w:szCs w:val="24"/>
                       <w:rtl w:val="0"/>
                     </w:rPr>
-                    <w:t xml:space="preserve">Recursos para juegos de rol: imágenes de frutas y verduras, lata de riego, cestas</w:t>
+                    <w:t xml:space="preserve">Materiales para el juego de rol: imágenes de frutas y verduras, una regadera y cestas</w:t>
                   </w:r>
                 </w:p>
                 <w:p>
@@ -3201,7 +3201,7 @@
                 <w:szCs w:val="24"/>
                 <w:rtl w:val="0"/>
               </w:rPr>
-              <w:t xml:space="preserve">Un estudiante (o el maestro) asumirá el papel de la IA ("Creo") y dará instrucciones a los demás estudiantes.</w:t>
+              <w:t xml:space="preserve">Un estudiante (o el docente) asumirá el papel de la IA («Brainy») y dará instrucciones a los demás estudiantes.</w:t>
               <w:br w:type="textWrapping"/>
             </w:r>
           </w:p>
@@ -3913,6 +3913,765 @@
                 <w:sz w:val="26"/>
                 <w:szCs w:val="26"/>
               </w:rPr>
+            </w:r>
+            <w:r>
+              <w:rPr>
+                <w:color w:val="000000"/>
+                <w:sz w:val="26"/>
+                <w:szCs w:val="26"/>
+                <w:rtl w:val="0"/>
+              </w:rPr>
+              <w:t xml:space="preserve"> La maestra comenzará con una historia:</w:t>
+            </w:r>
+            <w:r>
+              <w:rPr>
+                <w:rtl w:val="0"/>
+              </w:rPr>
+            </w:r>
+          </w:p>
+          <w:p>
+            <w:pPr>
+              <w:pStyle w:val="Heading3"/>
+              <w:keepNext w:val="0"/>
+              <w:keepLines w:val="0"/>
+              <w:spacing w:after="80" w:before="280" w:lineRule="auto"/>
+              <w:rPr>
+                <w:color w:val="000000"/>
+                <w:sz w:val="34"/>
+                <w:szCs w:val="34"/>
+              </w:rPr>
+            </w:pPr>
+            <w:bookmarkStart w:colFirst="0" w:colLast="0" w:name="_heading=h.qdzeym9dpsns" w:id="4"/>
+            <w:bookmarkEnd w:id="4"/>
+            <w:r>
+              <w:rPr>
+                <w:color w:val="000000"/>
+                <w:sz w:val="34"/>
+                <w:szCs w:val="34"/>
+                <w:rtl w:val="0"/>
+              </w:rPr>
+              <w:t xml:space="preserve">«Ella, la granjera, y los robots útiles»</w:t>
+            </w:r>
+          </w:p>
+          <w:p>
+            <w:pPr>
+              <w:spacing w:after="240" w:before="240" w:lineRule="auto"/>
+              <w:rPr>
+                <w:rFonts w:ascii="Calibri" w:cs="Calibri" w:eastAsia="Calibri" w:hAnsi="Calibri"/>
+              </w:rPr>
+            </w:pPr>
+            <w:r>
+              <w:rPr>
+                <w:rFonts w:ascii="Calibri" w:cs="Calibri" w:eastAsia="Calibri" w:hAnsi="Calibri"/>
+                <w:i w:val="1"/>
+                <w:rtl w:val="0"/>
+              </w:rPr>
+              <w:t xml:space="preserve">Esta es </w:t>
+            </w:r>
+            <w:r>
+              <w:rPr>
+                <w:rFonts w:ascii="Calibri" w:cs="Calibri" w:eastAsia="Calibri" w:hAnsi="Calibri"/>
+                <w:i w:val="1"/>
+                <w:rtl w:val="0"/>
+              </w:rPr>
+              <w:t xml:space="preserve">una historia sobre cómo los robots y las computadoras (IA) ayudan a hacer la comida que comemos todos los días.</w:t>
+            </w:r>
+            <w:r>
+              <w:rPr>
+                <w:rtl w:val="0"/>
+              </w:rPr>
+            </w:r>
+          </w:p>
+          <w:p>
+            <w:pPr>
+              <w:pStyle w:val="Heading3"/>
+              <w:keepNext w:val="0"/>
+              <w:keepLines w:val="0"/>
+              <w:spacing w:after="80" w:before="280" w:lineRule="auto"/>
+              <w:rPr>
+                <w:color w:val="000000"/>
+                <w:sz w:val="26"/>
+                <w:szCs w:val="26"/>
+              </w:rPr>
+            </w:pPr>
+            <w:bookmarkStart w:colFirst="0" w:colLast="0" w:name="_heading=h.pv16owpjxw7" w:id="5"/>
+            <w:bookmarkEnd w:id="5"/>
+            <w:r>
+              <w:rPr>
+                <w:color w:val="000000"/>
+                <w:sz w:val="26"/>
+                <w:szCs w:val="26"/>
+                <w:rtl w:val="0"/>
+              </w:rPr>
+              <w:t xml:space="preserve">Había una vez una granjera inteligente llamada Ella.</w:t>
+            </w:r>
+          </w:p>
+          <w:p>
+            <w:pPr>
+              <w:spacing w:after="240" w:before="240" w:lineRule="auto"/>
+              <w:rPr>
+                <w:rFonts w:ascii="Calibri" w:cs="Calibri" w:eastAsia="Calibri" w:hAnsi="Calibri"/>
+              </w:rPr>
+            </w:pPr>
+            <w:r>
+              <w:rPr>
+                <w:rFonts w:ascii="Calibri" w:cs="Calibri" w:eastAsia="Calibri" w:hAnsi="Calibri"/>
+                <w:rtl w:val="0"/>
+              </w:rPr>
+              <w:t xml:space="preserve">Vivía en una granja grande y soleada, donde cultivaba zanahorias, manzanas y lechuga. Ella no lo hacía todo sola: ¡tenía amigos </w:t>
+            </w:r>
+            <w:r>
+              <w:rPr>
+                <w:rFonts w:ascii="Calibri" w:cs="Calibri" w:eastAsia="Calibri" w:hAnsi="Calibri"/>
+                <w:b w:val="1"/>
+                <w:rtl w:val="0"/>
+              </w:rPr>
+              <w:t xml:space="preserve">robots y una </w:t>
+            </w:r>
+            <w:r>
+              <w:rPr>
+                <w:rFonts w:ascii="Calibri" w:cs="Calibri" w:eastAsia="Calibri" w:hAnsi="Calibri"/>
+                <w:rtl w:val="0"/>
+              </w:rPr>
+              <w:t xml:space="preserve">computadora muy inteligente </w:t>
+            </w:r>
+            <w:r>
+              <w:rPr>
+                <w:rFonts w:ascii="Calibri" w:cs="Calibri" w:eastAsia="Calibri" w:hAnsi="Calibri"/>
+                <w:b w:val="1"/>
+                <w:rtl w:val="0"/>
+              </w:rPr>
+              <w:t xml:space="preserve">que la ayudaba!</w:t>
+            </w:r>
+            <w:r>
+              <w:rPr>
+                <w:rFonts w:ascii="Calibri" w:cs="Calibri" w:eastAsia="Calibri" w:hAnsi="Calibri"/>
+                <w:rtl w:val="0"/>
+              </w:rPr>
+              <w:t xml:space="preserve"/>
+            </w:r>
+          </w:p>
+          <w:p>
+            <w:pPr>
+              <w:pStyle w:val="Heading3"/>
+              <w:keepNext w:val="0"/>
+              <w:keepLines w:val="0"/>
+              <w:spacing w:after="80" w:before="280" w:lineRule="auto"/>
+              <w:rPr>
+                <w:color w:val="000000"/>
+                <w:sz w:val="26"/>
+                <w:szCs w:val="26"/>
+              </w:rPr>
+            </w:pPr>
+            <w:bookmarkStart w:colFirst="0" w:colLast="0" w:name="_heading=h.u8vd8kivep92" w:id="6"/>
+            <w:bookmarkEnd w:id="6"/>
+            <w:r>
+              <w:rPr>
+                <w:color w:val="000000"/>
+                <w:sz w:val="26"/>
+                <w:szCs w:val="26"/>
+                <w:rtl w:val="0"/>
+              </w:rPr>
+              <w:t xml:space="preserve">Un robot llamado Picksy tenía brazos largos y ruedas.</w:t>
+            </w:r>
+          </w:p>
+          <w:p>
+            <w:pPr>
+              <w:spacing w:after="240" w:before="240" w:lineRule="auto"/>
+              <w:rPr>
+                <w:rFonts w:ascii="Calibri" w:cs="Calibri" w:eastAsia="Calibri" w:hAnsi="Calibri"/>
+              </w:rPr>
+            </w:pPr>
+            <w:r>
+              <w:rPr>
+                <w:rFonts w:ascii="Calibri" w:cs="Calibri" w:eastAsia="Calibri" w:hAnsi="Calibri"/>
+                <w:rtl w:val="0"/>
+              </w:rPr>
+              <w:t xml:space="preserve">Picksy se desplazaba por el huerto de </w:t>
+              <w:br w:type="textWrapping"/>
+              <w:t xml:space="preserve">manzanas. «¡Bip! ¡Bip! ¡Manzanas maduras a </w:t>
+              <w:br w:type="textWrapping"/>
+              <w:t xml:space="preserve">la vista!». Con un suave agarre, Picksy recogió manzanas rojas y las puso en cestas. ¡Incluso podía trabajar de noche con su pequeño faro!</w:t>
+            </w:r>
+          </w:p>
+          <w:p>
+            <w:pPr>
+              <w:pStyle w:val="Heading3"/>
+              <w:keepNext w:val="0"/>
+              <w:keepLines w:val="0"/>
+              <w:spacing w:after="80" w:before="280" w:lineRule="auto"/>
+              <w:rPr>
+                <w:color w:val="000000"/>
+                <w:sz w:val="26"/>
+                <w:szCs w:val="26"/>
+              </w:rPr>
+            </w:pPr>
+            <w:bookmarkStart w:colFirst="0" w:colLast="0" w:name="_heading=h.fc80r0ycwid7" w:id="7"/>
+            <w:bookmarkEnd w:id="7"/>
+            <w:r>
+              <w:rPr>
+                <w:color w:val="000000"/>
+                <w:sz w:val="26"/>
+                <w:szCs w:val="26"/>
+                <w:rtl w:val="0"/>
+              </w:rPr>
+              <w:t xml:space="preserve">Otro robot, llamado Sprinkles, ayudó a regar las verduras.</w:t>
+            </w:r>
+          </w:p>
+          <w:p>
+            <w:pPr>
+              <w:spacing w:after="240" w:before="240" w:lineRule="auto"/>
+              <w:rPr>
+                <w:rFonts w:ascii="Calibri" w:cs="Calibri" w:eastAsia="Calibri" w:hAnsi="Calibri"/>
+              </w:rPr>
+            </w:pPr>
+            <w:r>
+              <w:rPr>
+                <w:rFonts w:ascii="Calibri" w:cs="Calibri" w:eastAsia="Calibri" w:hAnsi="Calibri"/>
+                <w:rtl w:val="0"/>
+              </w:rPr>
+              <w:t xml:space="preserve">¡Pero Sprinkles no sólo rocía agua por todas partes! Una </w:t>
+              <w:br w:type="textWrapping"/>
+              <w:t xml:space="preserve"/>
+            </w:r>
+            <w:r>
+              <w:rPr>
+                <w:rFonts w:ascii="Calibri" w:cs="Calibri" w:eastAsia="Calibri" w:hAnsi="Calibri"/>
+                <w:b w:val="1"/>
+                <w:rtl w:val="0"/>
+              </w:rPr>
+              <w:t xml:space="preserve">computadora inteligente con IA le </w:t>
+            </w:r>
+            <w:r>
+              <w:rPr>
+                <w:rFonts w:ascii="Calibri" w:cs="Calibri" w:eastAsia="Calibri" w:hAnsi="Calibri"/>
+                <w:rtl w:val="0"/>
+              </w:rPr>
+              <w:t xml:space="preserve">dijo a Sprinkles,</w:t>
+            </w:r>
+          </w:p>
+          <w:p>
+            <w:pPr>
+              <w:spacing w:after="240" w:before="240" w:lineRule="auto"/>
+              <w:ind w:left="600" w:right="600" w:firstLine="0"/>
+              <w:rPr>
+                <w:rFonts w:ascii="Calibri" w:cs="Calibri" w:eastAsia="Calibri" w:hAnsi="Calibri"/>
+              </w:rPr>
+            </w:pPr>
+            <w:r>
+              <w:rPr>
+                <w:rFonts w:ascii="Calibri" w:cs="Calibri" w:eastAsia="Calibri" w:hAnsi="Calibri"/>
+                <w:rtl w:val="0"/>
+              </w:rPr>
+              <w:t xml:space="preserve">¡La lechuga está sedienta hoy, pero las zanahorias están bien!</w:t>
+            </w:r>
+          </w:p>
+          <w:p>
+            <w:pPr>
+              <w:spacing w:after="240" w:before="240" w:lineRule="auto"/>
+              <w:rPr>
+                <w:rFonts w:ascii="Calibri" w:cs="Calibri" w:eastAsia="Calibri" w:hAnsi="Calibri"/>
+              </w:rPr>
+            </w:pPr>
+            <w:r>
+              <w:rPr>
+                <w:rFonts w:ascii="Calibri" w:cs="Calibri" w:eastAsia="Calibri" w:hAnsi="Calibri"/>
+                <w:rtl w:val="0"/>
+              </w:rPr>
+              <w:t xml:space="preserve">Así que Sprinkles solo regó lo que necesitaba. De esta manera, no desperdiciaron agua y mantuvieron a las plantas felices.</w:t>
+            </w:r>
+          </w:p>
+          <w:p>
+            <w:pPr>
+              <w:pStyle w:val="Heading3"/>
+              <w:keepNext w:val="0"/>
+              <w:keepLines w:val="0"/>
+              <w:spacing w:after="80" w:before="280" w:lineRule="auto"/>
+              <w:rPr>
+                <w:color w:val="000000"/>
+                <w:sz w:val="26"/>
+                <w:szCs w:val="26"/>
+              </w:rPr>
+            </w:pPr>
+            <w:bookmarkStart w:colFirst="0" w:colLast="0" w:name="_heading=h.uiopf69p06f6" w:id="8"/>
+            <w:bookmarkEnd w:id="8"/>
+            <w:r>
+              <w:rPr>
+                <w:color w:val="000000"/>
+                <w:sz w:val="26"/>
+                <w:szCs w:val="26"/>
+                <w:rtl w:val="0"/>
+              </w:rPr>
+              <w:t xml:space="preserve">Dentro del granero estaba el cerebro de todo: una computadora inteligente llamada Brainy.</w:t>
+            </w:r>
+          </w:p>
+          <w:p>
+            <w:pPr>
+              <w:spacing w:after="240" w:before="240" w:lineRule="auto"/>
+              <w:rPr>
+                <w:rFonts w:ascii="Calibri" w:cs="Calibri" w:eastAsia="Calibri" w:hAnsi="Calibri"/>
+              </w:rPr>
+            </w:pPr>
+            <w:r>
+              <w:rPr>
+                <w:rFonts w:ascii="Calibri" w:cs="Calibri" w:eastAsia="Calibri" w:hAnsi="Calibri"/>
+                <w:rtl w:val="0"/>
+              </w:rPr>
+              <w:t xml:space="preserve">La computadora inteligente no tenía brazos ni piernas, ¡pero era de gran </w:t>
+              <w:br w:type="textWrapping"/>
+              <w:t xml:space="preserve">ayuda! Comprobó el tiempo, planeó cuándo plantar semillas e incluso le dijo a la granjera Ella:</w:t>
+            </w:r>
+          </w:p>
+          <w:p>
+            <w:pPr>
+              <w:spacing w:after="240" w:before="240" w:lineRule="auto"/>
+              <w:ind w:left="600" w:right="600" w:firstLine="0"/>
+              <w:rPr>
+                <w:rFonts w:ascii="Calibri" w:cs="Calibri" w:eastAsia="Calibri" w:hAnsi="Calibri"/>
+              </w:rPr>
+            </w:pPr>
+            <w:r>
+              <w:rPr>
+                <w:rFonts w:ascii="Calibri" w:cs="Calibri" w:eastAsia="Calibri" w:hAnsi="Calibri"/>
+                <w:rtl w:val="0"/>
+              </w:rPr>
+              <w:t xml:space="preserve">«¡Mañana hará sol, ideal para plantar patatas!»</w:t>
+            </w:r>
+          </w:p>
+          <w:p>
+            <w:pPr>
+              <w:pStyle w:val="Heading3"/>
+              <w:keepNext w:val="0"/>
+              <w:keepLines w:val="0"/>
+              <w:spacing w:after="80" w:before="280" w:lineRule="auto"/>
+              <w:rPr>
+                <w:color w:val="000000"/>
+                <w:sz w:val="26"/>
+                <w:szCs w:val="26"/>
+              </w:rPr>
+            </w:pPr>
+            <w:bookmarkStart w:colFirst="0" w:colLast="0" w:name="_heading=h.uge6d1xo4osr" w:id="9"/>
+            <w:bookmarkEnd w:id="9"/>
+            <w:r>
+              <w:rPr>
+                <w:color w:val="000000"/>
+                <w:sz w:val="26"/>
+                <w:szCs w:val="26"/>
+                <w:rtl w:val="0"/>
+              </w:rPr>
+              <w:t xml:space="preserve">En la fábrica cercana, los robots ayudaron a empacar la comida.</w:t>
+            </w:r>
+          </w:p>
+          <w:p>
+            <w:pPr>
+              <w:spacing w:after="240" w:before="240" w:lineRule="auto"/>
+              <w:rPr>
+                <w:rFonts w:ascii="Calibri" w:cs="Calibri" w:eastAsia="Calibri" w:hAnsi="Calibri"/>
+              </w:rPr>
+            </w:pPr>
+            <w:r>
+              <w:rPr>
+                <w:rFonts w:ascii="Calibri" w:cs="Calibri" w:eastAsia="Calibri" w:hAnsi="Calibri"/>
+                <w:rtl w:val="0"/>
+              </w:rPr>
+              <w:t xml:space="preserve">Las lechugas fueron a cajas de plástico limpias. </w:t>
+              <w:br w:type="textWrapping"/>
+              <w:t xml:space="preserve">Las zanahorias fueron ordenadas por </w:t>
+              <w:br w:type="textWrapping"/>
+              <w:t xml:space="preserve">tamaño. Se imprimieron etiquetas con nombres y fechas.</w:t>
+            </w:r>
+          </w:p>
+          <w:p>
+            <w:pPr>
+              <w:spacing w:after="240" w:before="240" w:lineRule="auto"/>
+              <w:rPr>
+                <w:rFonts w:ascii="Calibri" w:cs="Calibri" w:eastAsia="Calibri" w:hAnsi="Calibri"/>
+              </w:rPr>
+            </w:pPr>
+            <w:r>
+              <w:rPr>
+                <w:rFonts w:ascii="Calibri" w:cs="Calibri" w:eastAsia="Calibri" w:hAnsi="Calibri"/>
+                <w:rtl w:val="0"/>
+              </w:rPr>
+              <w:t xml:space="preserve">La IA comprobó todo para asegurarse de que la comida estaba </w:t>
+            </w:r>
+            <w:r>
+              <w:rPr>
+                <w:rFonts w:ascii="Calibri" w:cs="Calibri" w:eastAsia="Calibri" w:hAnsi="Calibri"/>
+                <w:b w:val="1"/>
+                <w:rtl w:val="0"/>
+              </w:rPr>
+              <w:t xml:space="preserve">limpia, fresca y segura para comer.</w:t>
+            </w:r>
+            <w:r>
+              <w:rPr>
+                <w:rFonts w:ascii="Calibri" w:cs="Calibri" w:eastAsia="Calibri" w:hAnsi="Calibri"/>
+                <w:rtl w:val="0"/>
+              </w:rPr>
+              <w:t xml:space="preserve"/>
+            </w:r>
+          </w:p>
+          <w:p>
+            <w:pPr>
+              <w:pStyle w:val="Heading3"/>
+              <w:keepNext w:val="0"/>
+              <w:keepLines w:val="0"/>
+              <w:spacing w:after="80" w:before="280" w:lineRule="auto"/>
+              <w:rPr>
+                <w:color w:val="000000"/>
+                <w:sz w:val="26"/>
+                <w:szCs w:val="26"/>
+              </w:rPr>
+            </w:pPr>
+            <w:bookmarkStart w:colFirst="0" w:colLast="0" w:name="_heading=h.r9s7q5bboxhg" w:id="10"/>
+            <w:bookmarkEnd w:id="10"/>
+            <w:r>
+              <w:rPr>
+                <w:color w:val="000000"/>
+                <w:sz w:val="26"/>
+                <w:szCs w:val="26"/>
+                <w:rtl w:val="0"/>
+              </w:rPr>
+              <w:t xml:space="preserve">Al día siguiente, los niños en la escuela abrieron sus cajas de almuerzo.</w:t>
+            </w:r>
+          </w:p>
+          <w:p>
+            <w:pPr>
+              <w:spacing w:after="240" w:before="240" w:lineRule="auto"/>
+              <w:rPr>
+                <w:rFonts w:ascii="Calibri" w:cs="Calibri" w:eastAsia="Calibri" w:hAnsi="Calibri"/>
+              </w:rPr>
+            </w:pPr>
+            <w:r>
+              <w:rPr>
+                <w:rFonts w:ascii="Calibri" w:cs="Calibri" w:eastAsia="Calibri" w:hAnsi="Calibri"/>
+                <w:rtl w:val="0"/>
+              </w:rPr>
+              <w:t xml:space="preserve">Dentro había manzanas crujientes, palos de zanahoria y lechuga fresca en sus sándwiches.</w:t>
+            </w:r>
+          </w:p>
+          <w:p>
+            <w:pPr>
+              <w:spacing w:after="240" w:before="240" w:lineRule="auto"/>
+              <w:rPr>
+                <w:rFonts w:ascii="Calibri" w:cs="Calibri" w:eastAsia="Calibri" w:hAnsi="Calibri"/>
+              </w:rPr>
+            </w:pPr>
+            <w:r>
+              <w:rPr>
+                <w:rFonts w:ascii="Calibri" w:cs="Calibri" w:eastAsia="Calibri" w:hAnsi="Calibri"/>
+                <w:rtl w:val="0"/>
+              </w:rPr>
+              <w:t xml:space="preserve">No lo sabían, pero la comida vino de la granja </w:t>
+            </w:r>
+            <w:r>
+              <w:rPr>
+                <w:rFonts w:ascii="Calibri" w:cs="Calibri" w:eastAsia="Calibri" w:hAnsi="Calibri"/>
+                <w:b w:val="1"/>
+                <w:rtl w:val="0"/>
+              </w:rPr>
+              <w:t xml:space="preserve">inteligente de la granjera Ella donde </w:t>
+            </w:r>
+            <w:r>
+              <w:rPr>
+                <w:rFonts w:ascii="Calibri" w:cs="Calibri" w:eastAsia="Calibri" w:hAnsi="Calibri"/>
+                <w:rtl w:val="0"/>
+              </w:rPr>
+              <w:t xml:space="preserve">los </w:t>
+            </w:r>
+            <w:r>
+              <w:rPr>
+                <w:rFonts w:ascii="Calibri" w:cs="Calibri" w:eastAsia="Calibri" w:hAnsi="Calibri"/>
+                <w:b w:val="1"/>
+                <w:rtl w:val="0"/>
+              </w:rPr>
+              <w:t xml:space="preserve">robots y la </w:t>
+            </w:r>
+            <w:r>
+              <w:rPr>
+                <w:rFonts w:ascii="Calibri" w:cs="Calibri" w:eastAsia="Calibri" w:hAnsi="Calibri"/>
+                <w:rtl w:val="0"/>
+              </w:rPr>
+              <w:t xml:space="preserve">IA ayudaron en cada paso del camino!</w:t>
+            </w:r>
+          </w:p>
+          <w:p>
+            <w:pPr>
+              <w:pStyle w:val="Heading3"/>
+              <w:keepNext w:val="0"/>
+              <w:keepLines w:val="0"/>
+              <w:spacing w:after="80" w:before="280" w:lineRule="auto"/>
+              <w:rPr>
+                <w:color w:val="000000"/>
+                <w:sz w:val="26"/>
+                <w:szCs w:val="26"/>
+              </w:rPr>
+            </w:pPr>
+            <w:bookmarkStart w:colFirst="0" w:colLast="0" w:name="_heading=h.9i6dr5f46nj0" w:id="11"/>
+            <w:bookmarkEnd w:id="11"/>
+            <w:r>
+              <w:rPr>
+                <w:color w:val="000000"/>
+                <w:sz w:val="26"/>
+                <w:szCs w:val="26"/>
+                <w:rtl w:val="0"/>
+              </w:rPr>
+              <w:t xml:space="preserve">A la hora de acostarse, la granjera Ella sonrió.</w:t>
+            </w:r>
+          </w:p>
+          <w:p>
+            <w:pPr>
+              <w:spacing w:after="240" w:before="240" w:lineRule="auto"/>
+              <w:ind w:left="600" w:right="600" w:firstLine="0"/>
+              <w:rPr>
+                <w:rFonts w:ascii="Calibri" w:cs="Calibri" w:eastAsia="Calibri" w:hAnsi="Calibri"/>
+              </w:rPr>
+            </w:pPr>
+            <w:r>
+              <w:rPr>
+                <w:rFonts w:ascii="Calibri" w:cs="Calibri" w:eastAsia="Calibri" w:hAnsi="Calibri"/>
+                <w:rtl w:val="0"/>
+              </w:rPr>
+              <w:t xml:space="preserve">Gracias, robots, dijo. ¡Juntos, </w:t>
+              <w:br w:type="textWrapping"/>
+              <w:t xml:space="preserve">cultivamos buena comida para todos!</w:t>
+            </w:r>
+          </w:p>
+          <w:p>
+            <w:pPr>
+              <w:spacing w:after="240" w:before="240" w:lineRule="auto"/>
+              <w:rPr>
+                <w:rFonts w:ascii="Calibri" w:cs="Calibri" w:eastAsia="Calibri" w:hAnsi="Calibri"/>
+              </w:rPr>
+            </w:pPr>
+            <w:r>
+              <w:rPr>
+                <w:rFonts w:ascii="Calibri" w:cs="Calibri" w:eastAsia="Calibri" w:hAnsi="Calibri"/>
+                <w:rtl w:val="0"/>
+              </w:rPr>
+              <w:t xml:space="preserve">Y los robots sonaron suavemente:</w:t>
+            </w:r>
+          </w:p>
+          <w:p>
+            <w:pPr>
+              <w:spacing w:after="240" w:before="240" w:lineRule="auto"/>
+              <w:ind w:left="600" w:right="600" w:firstLine="0"/>
+              <w:rPr>
+                <w:rFonts w:ascii="Calibri" w:cs="Calibri" w:eastAsia="Calibri" w:hAnsi="Calibri"/>
+              </w:rPr>
+            </w:pPr>
+            <w:r>
+              <w:rPr>
+                <w:rFonts w:ascii="Calibri" w:cs="Calibri" w:eastAsia="Calibri" w:hAnsi="Calibri"/>
+                <w:rtl w:val="0"/>
+              </w:rPr>
+              <w:t xml:space="preserve">«¡De nada, Ella!»</w:t>
+            </w:r>
+          </w:p>
+          <w:p>
+            <w:pPr>
+              <w:spacing w:after="240" w:before="240" w:lineRule="auto"/>
+              <w:rPr>
+                <w:rFonts w:ascii="Calibri" w:cs="Calibri" w:eastAsia="Calibri" w:hAnsi="Calibri"/>
+              </w:rPr>
+            </w:pPr>
+            <w:r>
+              <w:rPr>
+                <w:rFonts w:ascii="Calibri" w:cs="Calibri" w:eastAsia="Calibri" w:hAnsi="Calibri"/>
+                <w:b w:val="1"/>
+                <w:rtl w:val="0"/>
+              </w:rPr>
+              <w:t xml:space="preserve">El profesor hará estas preguntas:</w:t>
+            </w:r>
+            <w:r>
+              <w:rPr>
+                <w:rFonts w:ascii="Calibri" w:cs="Calibri" w:eastAsia="Calibri" w:hAnsi="Calibri"/>
+                <w:rtl w:val="0"/>
+              </w:rPr>
+              <w:t xml:space="preserve"/>
+            </w:r>
+          </w:p>
+          <w:p>
+            <w:pPr>
+              <w:numPr>
+                <w:ilvl w:val="0"/>
+                <w:numId w:val="20"/>
+              </w:numPr>
+              <w:spacing w:after="0" w:afterAutospacing="0" w:before="240" w:lineRule="auto"/>
+              <w:ind w:left="720" w:hanging="360"/>
+              <w:rPr>
+                <w:rFonts w:ascii="Calibri" w:cs="Calibri" w:eastAsia="Calibri" w:hAnsi="Calibri"/>
+              </w:rPr>
+            </w:pPr>
+            <w:r>
+              <w:rPr>
+                <w:rFonts w:ascii="Calibri" w:cs="Calibri" w:eastAsia="Calibri" w:hAnsi="Calibri"/>
+                <w:rtl w:val="0"/>
+              </w:rPr>
+              <w:t xml:space="preserve">¿Comes manzanas? ¿Lechugas? ¿Fresas?</w:t>
+              <w:br w:type="textWrapping"/>
+            </w:r>
+          </w:p>
+          <w:p>
+            <w:pPr>
+              <w:numPr>
+                <w:ilvl w:val="0"/>
+                <w:numId w:val="20"/>
+              </w:numPr>
+              <w:spacing w:after="0" w:afterAutospacing="0" w:before="0" w:beforeAutospacing="0" w:lineRule="auto"/>
+              <w:ind w:left="720" w:hanging="360"/>
+              <w:rPr>
+                <w:rFonts w:ascii="Calibri" w:cs="Calibri" w:eastAsia="Calibri" w:hAnsi="Calibri"/>
+              </w:rPr>
+            </w:pPr>
+            <w:r>
+              <w:rPr>
+                <w:rFonts w:ascii="Calibri" w:cs="Calibri" w:eastAsia="Calibri" w:hAnsi="Calibri"/>
+                <w:rtl w:val="0"/>
+              </w:rPr>
+              <w:t xml:space="preserve">¿Quién crees que ayuda a recoger y empacar toda esa comida?</w:t>
+              <w:br w:type="textWrapping"/>
+            </w:r>
+          </w:p>
+          <w:p>
+            <w:pPr>
+              <w:numPr>
+                <w:ilvl w:val="0"/>
+                <w:numId w:val="20"/>
+              </w:numPr>
+              <w:spacing w:after="0" w:afterAutospacing="0" w:before="0" w:beforeAutospacing="0" w:lineRule="auto"/>
+              <w:ind w:left="720" w:hanging="360"/>
+              <w:rPr>
+                <w:rFonts w:ascii="Calibri" w:cs="Calibri" w:eastAsia="Calibri" w:hAnsi="Calibri"/>
+              </w:rPr>
+            </w:pPr>
+            <w:r>
+              <w:rPr>
+                <w:rFonts w:ascii="Calibri" w:cs="Calibri" w:eastAsia="Calibri" w:hAnsi="Calibri"/>
+                <w:rtl w:val="0"/>
+              </w:rPr>
+              <w:t xml:space="preserve">¿Qué crees que pueden hacer los robots en una granja?</w:t>
+              <w:br w:type="textWrapping"/>
+            </w:r>
+          </w:p>
+          <w:p>
+            <w:pPr>
+              <w:numPr>
+                <w:ilvl w:val="0"/>
+                <w:numId w:val="20"/>
+              </w:numPr>
+              <w:spacing w:after="240" w:before="0" w:beforeAutospacing="0" w:lineRule="auto"/>
+              <w:ind w:left="720" w:hanging="360"/>
+              <w:rPr>
+                <w:rFonts w:ascii="Calibri" w:cs="Calibri" w:eastAsia="Calibri" w:hAnsi="Calibri"/>
+              </w:rPr>
+            </w:pPr>
+            <w:r>
+              <w:rPr>
+                <w:rFonts w:ascii="Calibri" w:cs="Calibri" w:eastAsia="Calibri" w:hAnsi="Calibri"/>
+                <w:rtl w:val="0"/>
+              </w:rPr>
+              <w:t xml:space="preserve">¿Alguna vez has hablado con una computadora inteligente antes?</w:t>
+              <w:br w:type="textWrapping"/>
+            </w:r>
+          </w:p>
+          <w:p>
+            <w:pPr>
+              <w:spacing w:after="240" w:before="240" w:lineRule="auto"/>
+              <w:rPr>
+                <w:rFonts w:ascii="Calibri" w:cs="Calibri" w:eastAsia="Calibri" w:hAnsi="Calibri"/>
+              </w:rPr>
+            </w:pPr>
+            <w:r>
+              <w:rPr>
+                <w:rFonts w:ascii="Calibri" w:cs="Calibri" w:eastAsia="Calibri" w:hAnsi="Calibri"/>
+                <w:b w:val="1"/>
+                <w:rtl w:val="0"/>
+              </w:rPr>
+              <w:t xml:space="preserve">Transición a </w:t>
+            </w:r>
+            <w:r>
+              <w:rPr>
+                <w:rFonts w:ascii="Calibri" w:cs="Calibri" w:eastAsia="Calibri" w:hAnsi="Calibri"/>
+                <w:rtl w:val="0"/>
+              </w:rPr>
+              <w:t xml:space="preserve">la actividad:</w:t>
+            </w:r>
+          </w:p>
+          <w:p>
+            <w:pPr>
+              <w:spacing w:after="240" w:before="240" w:lineRule="auto"/>
+              <w:ind w:left="600" w:right="600" w:firstLine="0"/>
+              <w:rPr>
+                <w:rFonts w:ascii="Calibri" w:cs="Calibri" w:eastAsia="Calibri" w:hAnsi="Calibri"/>
+              </w:rPr>
+            </w:pPr>
+            <w:r>
+              <w:rPr>
+                <w:rFonts w:ascii="Calibri" w:cs="Calibri" w:eastAsia="Calibri" w:hAnsi="Calibri"/>
+                <w:rtl w:val="0"/>
+              </w:rPr>
+              <w:t xml:space="preserve">¡Ahora TÚ puedes fingir ser los robots y computadoras que ayudan a hacer comida!</w:t>
+            </w:r>
+          </w:p>
+          <w:p>
+            <w:pPr>
+              <w:rPr>
+                <w:rFonts w:ascii="Calibri" w:cs="Calibri" w:eastAsia="Calibri" w:hAnsi="Calibri"/>
+              </w:rPr>
+            </w:pPr>
+            <w:r>
+              <w:rPr>
+                <w:rtl w:val="0"/>
+              </w:rPr>
+            </w:r>
+          </w:p>
+          <w:p>
+            <w:pPr>
+              <w:spacing w:after="280" w:before="280" w:line="240" w:lineRule="auto"/>
+              <w:rPr>
+                <w:rFonts w:ascii="Calibri" w:cs="Calibri" w:eastAsia="Calibri" w:hAnsi="Calibri"/>
+              </w:rPr>
+            </w:pPr>
+            <w:r>
+              <w:rPr>
+                <w:rtl w:val="0"/>
+              </w:rPr>
+            </w:r>
+          </w:p>
+          <w:p>
+            <w:pPr>
+              <w:spacing w:before="280" w:line="240" w:lineRule="auto"/>
+              <w:rPr>
+                <w:rFonts w:ascii="Calibri" w:cs="Calibri" w:eastAsia="Calibri" w:hAnsi="Calibri"/>
+              </w:rPr>
+            </w:pPr>
+            <w:r>
+              <w:rPr>
+                <w:rtl w:val="0"/>
+              </w:rPr>
+            </w:r>
+          </w:p>
+        </w:tc>
+      </w:tr>
+      <w:tr>
+        <w:trPr>
+          <w:cantSplit w:val="0"/>
+          <w:tblHeader w:val="0"/>
+        </w:trPr>
+        <w:tc>
+          <w:tcPr>
+            <w:shd w:fill="8db3e2" w:val="clear"/>
+          </w:tcPr>
+          <w:p>
+            <w:pPr>
+              <w:pStyle w:val="Heading3"/>
+              <w:keepNext w:val="0"/>
+              <w:keepLines w:val="0"/>
+              <w:spacing w:after="80" w:before="280" w:lineRule="auto"/>
+              <w:rPr/>
+            </w:pPr>
+            <w:r>
               <w:drawing>
                 <wp:inline distB="114300" distT="114300" distL="114300" distR="114300">
                   <wp:extent cx="8524875" cy="5689600"/>
@@ -3945,743 +4704,6 @@
                   </a:graphic>
                 </wp:inline>
               </w:drawing>
-            </w:r>
-            <w:r>
-              <w:rPr>
-                <w:color w:val="000000"/>
-                <w:sz w:val="26"/>
-                <w:szCs w:val="26"/>
-                <w:rtl w:val="0"/>
-              </w:rPr>
-              <w:t xml:space="preserve"> La maestra comenzará con una historia:</w:t>
-            </w:r>
-            <w:r>
-              <w:rPr>
-                <w:rtl w:val="0"/>
-              </w:rPr>
-            </w:r>
-          </w:p>
-          <w:p>
-            <w:pPr>
-              <w:pStyle w:val="Heading3"/>
-              <w:keepNext w:val="0"/>
-              <w:keepLines w:val="0"/>
-              <w:spacing w:after="80" w:before="280" w:lineRule="auto"/>
-              <w:rPr>
-                <w:color w:val="000000"/>
-                <w:sz w:val="34"/>
-                <w:szCs w:val="34"/>
-              </w:rPr>
-            </w:pPr>
-            <w:bookmarkStart w:colFirst="0" w:colLast="0" w:name="_heading=h.qdzeym9dpsns" w:id="4"/>
-            <w:bookmarkEnd w:id="4"/>
-            <w:r>
-              <w:rPr>
-                <w:color w:val="000000"/>
-                <w:sz w:val="34"/>
-                <w:szCs w:val="34"/>
-                <w:rtl w:val="0"/>
-              </w:rPr>
-              <w:t xml:space="preserve">"El campesino Ella y los robots útiles"</w:t>
-            </w:r>
-          </w:p>
-          <w:p>
-            <w:pPr>
-              <w:spacing w:after="240" w:before="240" w:lineRule="auto"/>
-              <w:rPr>
-                <w:rFonts w:ascii="Calibri" w:cs="Calibri" w:eastAsia="Calibri" w:hAnsi="Calibri"/>
-              </w:rPr>
-            </w:pPr>
-            <w:r>
-              <w:rPr>
-                <w:rFonts w:ascii="Calibri" w:cs="Calibri" w:eastAsia="Calibri" w:hAnsi="Calibri"/>
-                <w:i w:val="1"/>
-                <w:rtl w:val="0"/>
-              </w:rPr>
-              <w:t xml:space="preserve">Esta es </w:t>
-            </w:r>
-            <w:r>
-              <w:rPr>
-                <w:rFonts w:ascii="Calibri" w:cs="Calibri" w:eastAsia="Calibri" w:hAnsi="Calibri"/>
-                <w:i w:val="1"/>
-                <w:rtl w:val="0"/>
-              </w:rPr>
-              <w:t xml:space="preserve">una historia sobre cómo los robots y las computadoras (IA) ayudan a hacer la comida que comemos todos los días.</w:t>
-            </w:r>
-            <w:r>
-              <w:rPr>
-                <w:rtl w:val="0"/>
-              </w:rPr>
-            </w:r>
-          </w:p>
-          <w:p>
-            <w:pPr>
-              <w:pStyle w:val="Heading3"/>
-              <w:keepNext w:val="0"/>
-              <w:keepLines w:val="0"/>
-              <w:spacing w:after="80" w:before="280" w:lineRule="auto"/>
-              <w:rPr>
-                <w:color w:val="000000"/>
-                <w:sz w:val="26"/>
-                <w:szCs w:val="26"/>
-              </w:rPr>
-            </w:pPr>
-            <w:bookmarkStart w:colFirst="0" w:colLast="0" w:name="_heading=h.pv16owpjxw7" w:id="5"/>
-            <w:bookmarkEnd w:id="5"/>
-            <w:r>
-              <w:rPr>
-                <w:color w:val="000000"/>
-                <w:sz w:val="26"/>
-                <w:szCs w:val="26"/>
-                <w:rtl w:val="0"/>
-              </w:rPr>
-              <w:t xml:space="preserve">Había una vez una granjera inteligente llamada Ella.</w:t>
-            </w:r>
-          </w:p>
-          <w:p>
-            <w:pPr>
-              <w:spacing w:after="240" w:before="240" w:lineRule="auto"/>
-              <w:rPr>
-                <w:rFonts w:ascii="Calibri" w:cs="Calibri" w:eastAsia="Calibri" w:hAnsi="Calibri"/>
-              </w:rPr>
-            </w:pPr>
-            <w:r>
-              <w:rPr>
-                <w:rFonts w:ascii="Calibri" w:cs="Calibri" w:eastAsia="Calibri" w:hAnsi="Calibri"/>
-                <w:rtl w:val="0"/>
-              </w:rPr>
-              <w:t xml:space="preserve">Vivía en una granja llena de sol, donde cultivaba zanahorias, manzanas y lechuga. Ella no lo hizo todo sola. ¡Tenían amigos </w:t>
-            </w:r>
-            <w:r>
-              <w:rPr>
-                <w:rFonts w:ascii="Calibri" w:cs="Calibri" w:eastAsia="Calibri" w:hAnsi="Calibri"/>
-                <w:b w:val="1"/>
-                <w:rtl w:val="0"/>
-              </w:rPr>
-              <w:t xml:space="preserve">robots y </w:t>
-            </w:r>
-            <w:r>
-              <w:rPr>
-                <w:rFonts w:ascii="Calibri" w:cs="Calibri" w:eastAsia="Calibri" w:hAnsi="Calibri"/>
-                <w:rtl w:val="0"/>
-              </w:rPr>
-              <w:t xml:space="preserve">un ayudante de </w:t>
-            </w:r>
-            <w:r>
-              <w:rPr>
-                <w:rFonts w:ascii="Calibri" w:cs="Calibri" w:eastAsia="Calibri" w:hAnsi="Calibri"/>
-                <w:b w:val="1"/>
-                <w:rtl w:val="0"/>
-              </w:rPr>
-              <w:t xml:space="preserve">computadora súper inteligente!</w:t>
-            </w:r>
-            <w:r>
-              <w:rPr>
-                <w:rFonts w:ascii="Calibri" w:cs="Calibri" w:eastAsia="Calibri" w:hAnsi="Calibri"/>
-                <w:rtl w:val="0"/>
-              </w:rPr>
-              <w:t xml:space="preserve"/>
-            </w:r>
-          </w:p>
-          <w:p>
-            <w:pPr>
-              <w:pStyle w:val="Heading3"/>
-              <w:keepNext w:val="0"/>
-              <w:keepLines w:val="0"/>
-              <w:spacing w:after="80" w:before="280" w:lineRule="auto"/>
-              <w:rPr>
-                <w:color w:val="000000"/>
-                <w:sz w:val="26"/>
-                <w:szCs w:val="26"/>
-              </w:rPr>
-            </w:pPr>
-            <w:bookmarkStart w:colFirst="0" w:colLast="0" w:name="_heading=h.u8vd8kivep92" w:id="6"/>
-            <w:bookmarkEnd w:id="6"/>
-            <w:r>
-              <w:rPr>
-                <w:color w:val="000000"/>
-                <w:sz w:val="26"/>
-                <w:szCs w:val="26"/>
-                <w:rtl w:val="0"/>
-              </w:rPr>
-              <w:t xml:space="preserve">Un robot llamado Picksy tenía brazos y ruedas largas.</w:t>
-            </w:r>
-          </w:p>
-          <w:p>
-            <w:pPr>
-              <w:spacing w:after="240" w:before="240" w:lineRule="auto"/>
-              <w:rPr>
-                <w:rFonts w:ascii="Calibri" w:cs="Calibri" w:eastAsia="Calibri" w:hAnsi="Calibri"/>
-              </w:rPr>
-            </w:pPr>
-            <w:r>
-              <w:rPr>
-                <w:rFonts w:ascii="Calibri" w:cs="Calibri" w:eastAsia="Calibri" w:hAnsi="Calibri"/>
-                <w:rtl w:val="0"/>
-              </w:rPr>
-              <w:t xml:space="preserve">Picksy zoomó a través del huerto de </w:t>
-              <w:br w:type="textWrapping"/>
-              <w:t xml:space="preserve">manzanas. ¡Bip! ¡Bip! ¡Manzanas maduras! </w:t>
-              <w:br w:type="textWrapping"/>
-              <w:t xml:space="preserve">Con un suave agarre, Picksy recogió manzanas rojas y las puso en cestas. Incluso podía trabajar de noche con su pequeño faro.</w:t>
-            </w:r>
-          </w:p>
-          <w:p>
-            <w:pPr>
-              <w:pStyle w:val="Heading3"/>
-              <w:keepNext w:val="0"/>
-              <w:keepLines w:val="0"/>
-              <w:spacing w:after="80" w:before="280" w:lineRule="auto"/>
-              <w:rPr>
-                <w:color w:val="000000"/>
-                <w:sz w:val="26"/>
-                <w:szCs w:val="26"/>
-              </w:rPr>
-            </w:pPr>
-            <w:bookmarkStart w:colFirst="0" w:colLast="0" w:name="_heading=h.fc80r0ycwid7" w:id="7"/>
-            <w:bookmarkEnd w:id="7"/>
-            <w:r>
-              <w:rPr>
-                <w:color w:val="000000"/>
-                <w:sz w:val="26"/>
-                <w:szCs w:val="26"/>
-                <w:rtl w:val="0"/>
-              </w:rPr>
-              <w:t xml:space="preserve">Otro robot, llamado Sprinkles, ayudó a regar las verduras.</w:t>
-            </w:r>
-          </w:p>
-          <w:p>
-            <w:pPr>
-              <w:spacing w:after="240" w:before="240" w:lineRule="auto"/>
-              <w:rPr>
-                <w:rFonts w:ascii="Calibri" w:cs="Calibri" w:eastAsia="Calibri" w:hAnsi="Calibri"/>
-              </w:rPr>
-            </w:pPr>
-            <w:r>
-              <w:rPr>
-                <w:rFonts w:ascii="Calibri" w:cs="Calibri" w:eastAsia="Calibri" w:hAnsi="Calibri"/>
-                <w:rtl w:val="0"/>
-              </w:rPr>
-              <w:t xml:space="preserve">¡Pero Sprinkles no sólo rocía agua por todas partes! Una </w:t>
-              <w:br w:type="textWrapping"/>
-              <w:t xml:space="preserve"/>
-            </w:r>
-            <w:r>
-              <w:rPr>
-                <w:rFonts w:ascii="Calibri" w:cs="Calibri" w:eastAsia="Calibri" w:hAnsi="Calibri"/>
-                <w:b w:val="1"/>
-                <w:rtl w:val="0"/>
-              </w:rPr>
-              <w:t xml:space="preserve">computadora inteligente con IA le </w:t>
-            </w:r>
-            <w:r>
-              <w:rPr>
-                <w:rFonts w:ascii="Calibri" w:cs="Calibri" w:eastAsia="Calibri" w:hAnsi="Calibri"/>
-                <w:rtl w:val="0"/>
-              </w:rPr>
-              <w:t xml:space="preserve">dijo a Sprinkles,</w:t>
-            </w:r>
-          </w:p>
-          <w:p>
-            <w:pPr>
-              <w:spacing w:after="240" w:before="240" w:lineRule="auto"/>
-              <w:ind w:left="600" w:right="600" w:firstLine="0"/>
-              <w:rPr>
-                <w:rFonts w:ascii="Calibri" w:cs="Calibri" w:eastAsia="Calibri" w:hAnsi="Calibri"/>
-              </w:rPr>
-            </w:pPr>
-            <w:r>
-              <w:rPr>
-                <w:rFonts w:ascii="Calibri" w:cs="Calibri" w:eastAsia="Calibri" w:hAnsi="Calibri"/>
-                <w:rtl w:val="0"/>
-              </w:rPr>
-              <w:t xml:space="preserve">¡La lechuga está sedienta hoy, pero las zanahorias están bien!</w:t>
-            </w:r>
-          </w:p>
-          <w:p>
-            <w:pPr>
-              <w:spacing w:after="240" w:before="240" w:lineRule="auto"/>
-              <w:rPr>
-                <w:rFonts w:ascii="Calibri" w:cs="Calibri" w:eastAsia="Calibri" w:hAnsi="Calibri"/>
-              </w:rPr>
-            </w:pPr>
-            <w:r>
-              <w:rPr>
-                <w:rFonts w:ascii="Calibri" w:cs="Calibri" w:eastAsia="Calibri" w:hAnsi="Calibri"/>
-                <w:rtl w:val="0"/>
-              </w:rPr>
-              <w:t xml:space="preserve">Así que Sprinkles solo regó lo que necesitaba. De esta manera, no desperdiciaron agua y mantuvieron a las plantas felices.</w:t>
-            </w:r>
-          </w:p>
-          <w:p>
-            <w:pPr>
-              <w:pStyle w:val="Heading3"/>
-              <w:keepNext w:val="0"/>
-              <w:keepLines w:val="0"/>
-              <w:spacing w:after="80" w:before="280" w:lineRule="auto"/>
-              <w:rPr>
-                <w:color w:val="000000"/>
-                <w:sz w:val="26"/>
-                <w:szCs w:val="26"/>
-              </w:rPr>
-            </w:pPr>
-            <w:bookmarkStart w:colFirst="0" w:colLast="0" w:name="_heading=h.uiopf69p06f6" w:id="8"/>
-            <w:bookmarkEnd w:id="8"/>
-            <w:r>
-              <w:rPr>
-                <w:color w:val="000000"/>
-                <w:sz w:val="26"/>
-                <w:szCs w:val="26"/>
-                <w:rtl w:val="0"/>
-              </w:rPr>
-              <w:t xml:space="preserve">Dentro del granero estaba el cerebro de todo: una computadora inteligente llamada Brainy.</w:t>
-            </w:r>
-          </w:p>
-          <w:p>
-            <w:pPr>
-              <w:spacing w:after="240" w:before="240" w:lineRule="auto"/>
-              <w:rPr>
-                <w:rFonts w:ascii="Calibri" w:cs="Calibri" w:eastAsia="Calibri" w:hAnsi="Calibri"/>
-              </w:rPr>
-            </w:pPr>
-            <w:r>
-              <w:rPr>
-                <w:rFonts w:ascii="Calibri" w:cs="Calibri" w:eastAsia="Calibri" w:hAnsi="Calibri"/>
-                <w:rtl w:val="0"/>
-              </w:rPr>
-              <w:t xml:space="preserve">La inteligente no tenía brazos ni piernas, pero fue muy útil. </w:t>
-              <w:br w:type="textWrapping"/>
-              <w:t xml:space="preserve">Ella comprobó el tiempo, planeó cuándo plantar semillas e incluso le dijo a la granjera Ella:</w:t>
-            </w:r>
-          </w:p>
-          <w:p>
-            <w:pPr>
-              <w:spacing w:after="240" w:before="240" w:lineRule="auto"/>
-              <w:ind w:left="600" w:right="600" w:firstLine="0"/>
-              <w:rPr>
-                <w:rFonts w:ascii="Calibri" w:cs="Calibri" w:eastAsia="Calibri" w:hAnsi="Calibri"/>
-              </w:rPr>
-            </w:pPr>
-            <w:r>
-              <w:rPr>
-                <w:rFonts w:ascii="Calibri" w:cs="Calibri" w:eastAsia="Calibri" w:hAnsi="Calibri"/>
-                <w:rtl w:val="0"/>
-              </w:rPr>
-              <w:t xml:space="preserve">¡Mañana será soleado! ¡Gran para plantar papas!</w:t>
-            </w:r>
-          </w:p>
-          <w:p>
-            <w:pPr>
-              <w:pStyle w:val="Heading3"/>
-              <w:keepNext w:val="0"/>
-              <w:keepLines w:val="0"/>
-              <w:spacing w:after="80" w:before="280" w:lineRule="auto"/>
-              <w:rPr>
-                <w:color w:val="000000"/>
-                <w:sz w:val="26"/>
-                <w:szCs w:val="26"/>
-              </w:rPr>
-            </w:pPr>
-            <w:bookmarkStart w:colFirst="0" w:colLast="0" w:name="_heading=h.uge6d1xo4osr" w:id="9"/>
-            <w:bookmarkEnd w:id="9"/>
-            <w:r>
-              <w:rPr>
-                <w:color w:val="000000"/>
-                <w:sz w:val="26"/>
-                <w:szCs w:val="26"/>
-                <w:rtl w:val="0"/>
-              </w:rPr>
-              <w:t xml:space="preserve">En la fábrica cercana, los robots ayudaron a empacar la comida.</w:t>
-            </w:r>
-          </w:p>
-          <w:p>
-            <w:pPr>
-              <w:spacing w:after="240" w:before="240" w:lineRule="auto"/>
-              <w:rPr>
-                <w:rFonts w:ascii="Calibri" w:cs="Calibri" w:eastAsia="Calibri" w:hAnsi="Calibri"/>
-              </w:rPr>
-            </w:pPr>
-            <w:r>
-              <w:rPr>
-                <w:rFonts w:ascii="Calibri" w:cs="Calibri" w:eastAsia="Calibri" w:hAnsi="Calibri"/>
-                <w:rtl w:val="0"/>
-              </w:rPr>
-              <w:t xml:space="preserve">¡Azoque! La letús fue a cajas de plástico limpias. </w:t>
-              <w:br w:type="textWrapping"/>
-              <w:t xml:space="preserve">¡Virrete! Las zanahorias fueron ordenadas por tamaño. </w:t>
-              <w:br w:type="textWrapping"/>
-              <w:t xml:space="preserve">¡Clique en él! Etiquetas impresas con nombres y fechas.</w:t>
-            </w:r>
-          </w:p>
-          <w:p>
-            <w:pPr>
-              <w:spacing w:after="240" w:before="240" w:lineRule="auto"/>
-              <w:rPr>
-                <w:rFonts w:ascii="Calibri" w:cs="Calibri" w:eastAsia="Calibri" w:hAnsi="Calibri"/>
-              </w:rPr>
-            </w:pPr>
-            <w:r>
-              <w:rPr>
-                <w:rFonts w:ascii="Calibri" w:cs="Calibri" w:eastAsia="Calibri" w:hAnsi="Calibri"/>
-                <w:rtl w:val="0"/>
-              </w:rPr>
-              <w:t xml:space="preserve">La IA comprobó todo para asegurarse de que la comida estaba </w:t>
-            </w:r>
-            <w:r>
-              <w:rPr>
-                <w:rFonts w:ascii="Calibri" w:cs="Calibri" w:eastAsia="Calibri" w:hAnsi="Calibri"/>
-                <w:b w:val="1"/>
-                <w:rtl w:val="0"/>
-              </w:rPr>
-              <w:t xml:space="preserve">limpia, fresca y segura para comer.</w:t>
-            </w:r>
-            <w:r>
-              <w:rPr>
-                <w:rFonts w:ascii="Calibri" w:cs="Calibri" w:eastAsia="Calibri" w:hAnsi="Calibri"/>
-                <w:rtl w:val="0"/>
-              </w:rPr>
-              <w:t xml:space="preserve"/>
-            </w:r>
-          </w:p>
-          <w:p>
-            <w:pPr>
-              <w:pStyle w:val="Heading3"/>
-              <w:keepNext w:val="0"/>
-              <w:keepLines w:val="0"/>
-              <w:spacing w:after="80" w:before="280" w:lineRule="auto"/>
-              <w:rPr>
-                <w:color w:val="000000"/>
-                <w:sz w:val="26"/>
-                <w:szCs w:val="26"/>
-              </w:rPr>
-            </w:pPr>
-            <w:bookmarkStart w:colFirst="0" w:colLast="0" w:name="_heading=h.r9s7q5bboxhg" w:id="10"/>
-            <w:bookmarkEnd w:id="10"/>
-            <w:r>
-              <w:rPr>
-                <w:color w:val="000000"/>
-                <w:sz w:val="26"/>
-                <w:szCs w:val="26"/>
-                <w:rtl w:val="0"/>
-              </w:rPr>
-              <w:t xml:space="preserve">Al día siguiente, los niños en la escuela abrieron sus cajas de almuerzo.</w:t>
-            </w:r>
-          </w:p>
-          <w:p>
-            <w:pPr>
-              <w:spacing w:after="240" w:before="240" w:lineRule="auto"/>
-              <w:rPr>
-                <w:rFonts w:ascii="Calibri" w:cs="Calibri" w:eastAsia="Calibri" w:hAnsi="Calibri"/>
-              </w:rPr>
-            </w:pPr>
-            <w:r>
-              <w:rPr>
-                <w:rFonts w:ascii="Calibri" w:cs="Calibri" w:eastAsia="Calibri" w:hAnsi="Calibri"/>
-                <w:rtl w:val="0"/>
-              </w:rPr>
-              <w:t xml:space="preserve">Dentro había manzanas crujientes, palos de zanahoria y lechuga fresca en sus sándwiches.</w:t>
-            </w:r>
-          </w:p>
-          <w:p>
-            <w:pPr>
-              <w:spacing w:after="240" w:before="240" w:lineRule="auto"/>
-              <w:rPr>
-                <w:rFonts w:ascii="Calibri" w:cs="Calibri" w:eastAsia="Calibri" w:hAnsi="Calibri"/>
-              </w:rPr>
-            </w:pPr>
-            <w:r>
-              <w:rPr>
-                <w:rFonts w:ascii="Calibri" w:cs="Calibri" w:eastAsia="Calibri" w:hAnsi="Calibri"/>
-                <w:rtl w:val="0"/>
-              </w:rPr>
-              <w:t xml:space="preserve">No lo sabían, pero la comida vino de la granja </w:t>
-            </w:r>
-            <w:r>
-              <w:rPr>
-                <w:rFonts w:ascii="Calibri" w:cs="Calibri" w:eastAsia="Calibri" w:hAnsi="Calibri"/>
-                <w:b w:val="1"/>
-                <w:rtl w:val="0"/>
-              </w:rPr>
-              <w:t xml:space="preserve">inteligente de la granjera Ella donde </w:t>
-            </w:r>
-            <w:r>
-              <w:rPr>
-                <w:rFonts w:ascii="Calibri" w:cs="Calibri" w:eastAsia="Calibri" w:hAnsi="Calibri"/>
-                <w:rtl w:val="0"/>
-              </w:rPr>
-              <w:t xml:space="preserve">los </w:t>
-            </w:r>
-            <w:r>
-              <w:rPr>
-                <w:rFonts w:ascii="Calibri" w:cs="Calibri" w:eastAsia="Calibri" w:hAnsi="Calibri"/>
-                <w:b w:val="1"/>
-                <w:rtl w:val="0"/>
-              </w:rPr>
-              <w:t xml:space="preserve">robots y la </w:t>
-            </w:r>
-            <w:r>
-              <w:rPr>
-                <w:rFonts w:ascii="Calibri" w:cs="Calibri" w:eastAsia="Calibri" w:hAnsi="Calibri"/>
-                <w:rtl w:val="0"/>
-              </w:rPr>
-              <w:t xml:space="preserve">IA ayudaron en cada paso del camino!</w:t>
-            </w:r>
-          </w:p>
-          <w:p>
-            <w:pPr>
-              <w:pStyle w:val="Heading3"/>
-              <w:keepNext w:val="0"/>
-              <w:keepLines w:val="0"/>
-              <w:spacing w:after="80" w:before="280" w:lineRule="auto"/>
-              <w:rPr>
-                <w:color w:val="000000"/>
-                <w:sz w:val="26"/>
-                <w:szCs w:val="26"/>
-              </w:rPr>
-            </w:pPr>
-            <w:bookmarkStart w:colFirst="0" w:colLast="0" w:name="_heading=h.9i6dr5f46nj0" w:id="11"/>
-            <w:bookmarkEnd w:id="11"/>
-            <w:r>
-              <w:rPr>
-                <w:color w:val="000000"/>
-                <w:sz w:val="26"/>
-                <w:szCs w:val="26"/>
-                <w:rtl w:val="0"/>
-              </w:rPr>
-              <w:t xml:space="preserve">A la hora de acostarse, la granjera Ella sonrió.</w:t>
-            </w:r>
-          </w:p>
-          <w:p>
-            <w:pPr>
-              <w:spacing w:after="240" w:before="240" w:lineRule="auto"/>
-              <w:ind w:left="600" w:right="600" w:firstLine="0"/>
-              <w:rPr>
-                <w:rFonts w:ascii="Calibri" w:cs="Calibri" w:eastAsia="Calibri" w:hAnsi="Calibri"/>
-              </w:rPr>
-            </w:pPr>
-            <w:r>
-              <w:rPr>
-                <w:rFonts w:ascii="Calibri" w:cs="Calibri" w:eastAsia="Calibri" w:hAnsi="Calibri"/>
-                <w:rtl w:val="0"/>
-              </w:rPr>
-              <w:t xml:space="preserve">Gracias, robots, dijo. ¡Juntos, </w:t>
-              <w:br w:type="textWrapping"/>
-              <w:t xml:space="preserve">cultivamos buena comida para todos!</w:t>
-            </w:r>
-          </w:p>
-          <w:p>
-            <w:pPr>
-              <w:spacing w:after="240" w:before="240" w:lineRule="auto"/>
-              <w:rPr>
-                <w:rFonts w:ascii="Calibri" w:cs="Calibri" w:eastAsia="Calibri" w:hAnsi="Calibri"/>
-              </w:rPr>
-            </w:pPr>
-            <w:r>
-              <w:rPr>
-                <w:rFonts w:ascii="Calibri" w:cs="Calibri" w:eastAsia="Calibri" w:hAnsi="Calibri"/>
-                <w:rtl w:val="0"/>
-              </w:rPr>
-              <w:t xml:space="preserve">Y los robots sonaron suavemente:</w:t>
-            </w:r>
-          </w:p>
-          <w:p>
-            <w:pPr>
-              <w:spacing w:after="240" w:before="240" w:lineRule="auto"/>
-              <w:ind w:left="600" w:right="600" w:firstLine="0"/>
-              <w:rPr>
-                <w:rFonts w:ascii="Calibri" w:cs="Calibri" w:eastAsia="Calibri" w:hAnsi="Calibri"/>
-              </w:rPr>
-            </w:pPr>
-            <w:r>
-              <w:rPr>
-                <w:rFonts w:ascii="Calibri" w:cs="Calibri" w:eastAsia="Calibri" w:hAnsi="Calibri"/>
-                <w:rtl w:val="0"/>
-              </w:rPr>
-              <w:t xml:space="preserve">¡Estás bienvenida, Ella!</w:t>
-            </w:r>
-          </w:p>
-          <w:p>
-            <w:pPr>
-              <w:spacing w:after="240" w:before="240" w:lineRule="auto"/>
-              <w:rPr>
-                <w:rFonts w:ascii="Calibri" w:cs="Calibri" w:eastAsia="Calibri" w:hAnsi="Calibri"/>
-              </w:rPr>
-            </w:pPr>
-            <w:r>
-              <w:rPr>
-                <w:rFonts w:ascii="Calibri" w:cs="Calibri" w:eastAsia="Calibri" w:hAnsi="Calibri"/>
-                <w:b w:val="1"/>
-                <w:rtl w:val="0"/>
-              </w:rPr>
-              <w:t xml:space="preserve">El profesor hará estas preguntas:</w:t>
-            </w:r>
-            <w:r>
-              <w:rPr>
-                <w:rFonts w:ascii="Calibri" w:cs="Calibri" w:eastAsia="Calibri" w:hAnsi="Calibri"/>
-                <w:rtl w:val="0"/>
-              </w:rPr>
-              <w:t xml:space="preserve"/>
-            </w:r>
-          </w:p>
-          <w:p>
-            <w:pPr>
-              <w:numPr>
-                <w:ilvl w:val="0"/>
-                <w:numId w:val="20"/>
-              </w:numPr>
-              <w:spacing w:after="0" w:afterAutospacing="0" w:before="240" w:lineRule="auto"/>
-              <w:ind w:left="720" w:hanging="360"/>
-              <w:rPr>
-                <w:rFonts w:ascii="Calibri" w:cs="Calibri" w:eastAsia="Calibri" w:hAnsi="Calibri"/>
-              </w:rPr>
-            </w:pPr>
-            <w:r>
-              <w:rPr>
-                <w:rFonts w:ascii="Calibri" w:cs="Calibri" w:eastAsia="Calibri" w:hAnsi="Calibri"/>
-                <w:rtl w:val="0"/>
-              </w:rPr>
-              <w:t xml:space="preserve">¿Comes manzanas? ¿La letús? ¿Las fresas?</w:t>
-              <w:br w:type="textWrapping"/>
-            </w:r>
-          </w:p>
-          <w:p>
-            <w:pPr>
-              <w:numPr>
-                <w:ilvl w:val="0"/>
-                <w:numId w:val="20"/>
-              </w:numPr>
-              <w:spacing w:after="0" w:afterAutospacing="0" w:before="0" w:beforeAutospacing="0" w:lineRule="auto"/>
-              <w:ind w:left="720" w:hanging="360"/>
-              <w:rPr>
-                <w:rFonts w:ascii="Calibri" w:cs="Calibri" w:eastAsia="Calibri" w:hAnsi="Calibri"/>
-              </w:rPr>
-            </w:pPr>
-            <w:r>
-              <w:rPr>
-                <w:rFonts w:ascii="Calibri" w:cs="Calibri" w:eastAsia="Calibri" w:hAnsi="Calibri"/>
-                <w:rtl w:val="0"/>
-              </w:rPr>
-              <w:t xml:space="preserve">¿Quién crees que ayuda a recoger y empacar toda esa comida?</w:t>
-              <w:br w:type="textWrapping"/>
-            </w:r>
-          </w:p>
-          <w:p>
-            <w:pPr>
-              <w:numPr>
-                <w:ilvl w:val="0"/>
-                <w:numId w:val="20"/>
-              </w:numPr>
-              <w:spacing w:after="0" w:afterAutospacing="0" w:before="0" w:beforeAutospacing="0" w:lineRule="auto"/>
-              <w:ind w:left="720" w:hanging="360"/>
-              <w:rPr>
-                <w:rFonts w:ascii="Calibri" w:cs="Calibri" w:eastAsia="Calibri" w:hAnsi="Calibri"/>
-              </w:rPr>
-            </w:pPr>
-            <w:r>
-              <w:rPr>
-                <w:rFonts w:ascii="Calibri" w:cs="Calibri" w:eastAsia="Calibri" w:hAnsi="Calibri"/>
-                <w:rtl w:val="0"/>
-              </w:rPr>
-              <w:t xml:space="preserve">¿Qué crees que pueden hacer los robots en una granja?</w:t>
-              <w:br w:type="textWrapping"/>
-            </w:r>
-          </w:p>
-          <w:p>
-            <w:pPr>
-              <w:numPr>
-                <w:ilvl w:val="0"/>
-                <w:numId w:val="20"/>
-              </w:numPr>
-              <w:spacing w:after="240" w:before="0" w:beforeAutospacing="0" w:lineRule="auto"/>
-              <w:ind w:left="720" w:hanging="360"/>
-              <w:rPr>
-                <w:rFonts w:ascii="Calibri" w:cs="Calibri" w:eastAsia="Calibri" w:hAnsi="Calibri"/>
-              </w:rPr>
-            </w:pPr>
-            <w:r>
-              <w:rPr>
-                <w:rFonts w:ascii="Calibri" w:cs="Calibri" w:eastAsia="Calibri" w:hAnsi="Calibri"/>
-                <w:rtl w:val="0"/>
-              </w:rPr>
-              <w:t xml:space="preserve">¿Alguna vez has hablado con una computadora inteligente antes?</w:t>
-              <w:br w:type="textWrapping"/>
-            </w:r>
-          </w:p>
-          <w:p>
-            <w:pPr>
-              <w:spacing w:after="240" w:before="240" w:lineRule="auto"/>
-              <w:rPr>
-                <w:rFonts w:ascii="Calibri" w:cs="Calibri" w:eastAsia="Calibri" w:hAnsi="Calibri"/>
-              </w:rPr>
-            </w:pPr>
-            <w:r>
-              <w:rPr>
-                <w:rFonts w:ascii="Calibri" w:cs="Calibri" w:eastAsia="Calibri" w:hAnsi="Calibri"/>
-                <w:b w:val="1"/>
-                <w:rtl w:val="0"/>
-              </w:rPr>
-              <w:t xml:space="preserve">Transición a </w:t>
-            </w:r>
-            <w:r>
-              <w:rPr>
-                <w:rFonts w:ascii="Calibri" w:cs="Calibri" w:eastAsia="Calibri" w:hAnsi="Calibri"/>
-                <w:rtl w:val="0"/>
-              </w:rPr>
-              <w:t xml:space="preserve">la actividad:</w:t>
-            </w:r>
-          </w:p>
-          <w:p>
-            <w:pPr>
-              <w:spacing w:after="240" w:before="240" w:lineRule="auto"/>
-              <w:ind w:left="600" w:right="600" w:firstLine="0"/>
-              <w:rPr>
-                <w:rFonts w:ascii="Calibri" w:cs="Calibri" w:eastAsia="Calibri" w:hAnsi="Calibri"/>
-              </w:rPr>
-            </w:pPr>
-            <w:r>
-              <w:rPr>
-                <w:rFonts w:ascii="Calibri" w:cs="Calibri" w:eastAsia="Calibri" w:hAnsi="Calibri"/>
-                <w:rtl w:val="0"/>
-              </w:rPr>
-              <w:t xml:space="preserve">¡Ahora TÚ puedes fingir ser los robots y computadoras que ayudan a hacer comida!</w:t>
-            </w:r>
-          </w:p>
-          <w:p>
-            <w:pPr>
-              <w:rPr>
-                <w:rFonts w:ascii="Calibri" w:cs="Calibri" w:eastAsia="Calibri" w:hAnsi="Calibri"/>
-              </w:rPr>
-            </w:pPr>
-            <w:r>
-              <w:rPr>
-                <w:rtl w:val="0"/>
-              </w:rPr>
-            </w:r>
-          </w:p>
-          <w:p>
-            <w:pPr>
-              <w:spacing w:after="280" w:before="280" w:line="240" w:lineRule="auto"/>
-              <w:rPr>
-                <w:rFonts w:ascii="Calibri" w:cs="Calibri" w:eastAsia="Calibri" w:hAnsi="Calibri"/>
-              </w:rPr>
-            </w:pPr>
-            <w:r>
-              <w:rPr>
-                <w:rtl w:val="0"/>
-              </w:rPr>
-            </w:r>
-          </w:p>
-          <w:p>
-            <w:pPr>
-              <w:spacing w:before="280" w:line="240" w:lineRule="auto"/>
-              <w:rPr>
-                <w:rFonts w:ascii="Calibri" w:cs="Calibri" w:eastAsia="Calibri" w:hAnsi="Calibri"/>
-              </w:rPr>
-            </w:pPr>
-            <w:r>
-              <w:rPr>
-                <w:rtl w:val="0"/>
-              </w:rPr>
             </w:r>
           </w:p>
         </w:tc>
@@ -4924,7 +4946,7 @@
                 <w:szCs w:val="24"/>
                 <w:rtl w:val="0"/>
               </w:rPr>
-              <w:t xml:space="preserve">(algunos estudiantes serán robots) Picksy (robot picker) actúa en el comando. Sprinkles (regado de robots) sigue las instrucciones de la IA. Packy (robot de embalaje) envases suaves juegan la comida en cestas o cajas.</w:t>
+              <w:t xml:space="preserve">(algunos estudiantes serán robots): Picksy (robot recolector) actúa siguiendo las órdenes. Sprinkles (robot de riego de plantas) sigue las instrucciones de la IA. Packy (robot de embalaje) coloca con cuidado los alimentos de juguete en cestas o cajas.</w:t>
             </w:r>
           </w:p>
           <w:p>
@@ -4985,7 +5007,7 @@
                 <w:szCs w:val="24"/>
                 <w:rtl w:val="0"/>
               </w:rPr>
-              <w:t xml:space="preserve">Sólo riego las plantas que están caídas.</w:t>
+              <w:t xml:space="preserve">«Riega solo las plantas que están mustias».</w:t>
               <w:br w:type="textWrapping"/>
             </w:r>
           </w:p>
@@ -5035,7 +5057,7 @@
                 <w:szCs w:val="24"/>
                 <w:rtl w:val="0"/>
               </w:rPr>
-              <w:t xml:space="preserve">¡No reges hoy, está lloviendo!</w:t>
+              <w:t xml:space="preserve">«¡No riegues hoy, está lloviendo!»</w:t>
             </w:r>
           </w:p>
           <w:p>
@@ -5084,7 +5106,7 @@
                 <w:szCs w:val="24"/>
                 <w:rtl w:val="0"/>
               </w:rPr>
-              <w:t xml:space="preserve">El profesor proporcionará accesorios </w:t>
+              <w:t xml:space="preserve">El docente proporcionará accesorios </w:t>
             </w:r>
             <w:r>
               <w:rPr>
@@ -5094,7 +5116,7 @@
                 <w:szCs w:val="24"/>
                 <w:rtl w:val="0"/>
               </w:rPr>
-              <w:t xml:space="preserve">o impresiones (por </w:t>
+              <w:t xml:space="preserve">o imágenes impresas </w:t>
             </w:r>
             <w:r>
               <w:rPr>
@@ -5103,7 +5125,7 @@
                 <w:szCs w:val="24"/>
                 <w:rtl w:val="0"/>
               </w:rPr>
-              <w:t xml:space="preserve">ejemplo: frutas de papel, latas de regado, guantes, cestas).</w:t>
+              <w:t xml:space="preserve">(por ejemplo, frutas de papel, regaderas, guantes y cestas).</w:t>
             </w:r>
           </w:p>
           <w:p>
@@ -6191,6 +6213,81 @@
                 <w:sz w:val="20"/>
                 <w:szCs w:val="20"/>
               </w:rPr>
+            </w:r>
+            <w:r>
+              <w:rPr>
+                <w:rtl w:val="0"/>
+              </w:rPr>
+            </w:r>
+          </w:p>
+          <w:p>
+            <w:pPr>
+              <w:spacing w:after="240" w:before="240" w:lineRule="auto"/>
+              <w:ind w:left="600" w:right="600" w:firstLine="0"/>
+              <w:rPr>
+                <w:rFonts w:ascii="Calibri" w:cs="Calibri" w:eastAsia="Calibri" w:hAnsi="Calibri"/>
+                <w:sz w:val="20"/>
+                <w:szCs w:val="20"/>
+              </w:rPr>
+            </w:pPr>
+            <w:r>
+              <w:rPr>
+                <w:rtl w:val="0"/>
+              </w:rPr>
+            </w:r>
+          </w:p>
+          <w:p>
+            <w:pPr>
+              <w:spacing w:after="240" w:before="240" w:lineRule="auto"/>
+              <w:ind w:left="600" w:right="600" w:firstLine="0"/>
+              <w:rPr>
+                <w:rFonts w:ascii="Calibri" w:cs="Calibri" w:eastAsia="Calibri" w:hAnsi="Calibri"/>
+                <w:sz w:val="20"/>
+                <w:szCs w:val="20"/>
+              </w:rPr>
+            </w:pPr>
+            <w:r>
+              <w:rPr>
+                <w:rtl w:val="0"/>
+              </w:rPr>
+            </w:r>
+          </w:p>
+          <w:p>
+            <w:pPr>
+              <w:rPr>
+                <w:rFonts w:ascii="Calibri" w:cs="Calibri" w:eastAsia="Calibri" w:hAnsi="Calibri"/>
+                <w:sz w:val="24"/>
+                <w:szCs w:val="24"/>
+              </w:rPr>
+            </w:pPr>
+            <w:r>
+              <w:rPr>
+                <w:rtl w:val="0"/>
+              </w:rPr>
+            </w:r>
+          </w:p>
+        </w:tc>
+      </w:tr>
+      <w:tr>
+        <w:trPr>
+          <w:cantSplit w:val="0"/>
+          <w:tblHeader w:val="0"/>
+        </w:trPr>
+        <w:tc>
+          <w:tcPr>
+            <w:shd w:fill="ffc000" w:val="clear"/>
+          </w:tcPr>
+          <w:p>
+            <w:pPr>
+              <w:spacing w:after="240" w:before="240" w:lineRule="auto"/>
+              <w:ind w:left="600" w:right="600" w:firstLine="0"/>
+              <w:rPr>
+                <w:rFonts w:ascii="Calibri" w:cs="Calibri" w:eastAsia="Calibri" w:hAnsi="Calibri"/>
+                <w:sz w:val="20"/>
+                <w:szCs w:val="20"/>
+              </w:rPr>
+            </w:pPr>
+            <w:r>
               <w:drawing>
                 <wp:inline distB="114300" distT="114300" distL="114300" distR="114300">
                   <wp:extent cx="4443413" cy="4443413"/>
@@ -6223,57 +6320,6 @@
                   </a:graphic>
                 </wp:inline>
               </w:drawing>
-            </w:r>
-            <w:r>
-              <w:rPr>
-                <w:rtl w:val="0"/>
-              </w:rPr>
-            </w:r>
-          </w:p>
-          <w:p>
-            <w:pPr>
-              <w:spacing w:after="240" w:before="240" w:lineRule="auto"/>
-              <w:ind w:left="600" w:right="600" w:firstLine="0"/>
-              <w:rPr>
-                <w:rFonts w:ascii="Calibri" w:cs="Calibri" w:eastAsia="Calibri" w:hAnsi="Calibri"/>
-                <w:sz w:val="20"/>
-                <w:szCs w:val="20"/>
-              </w:rPr>
-            </w:pPr>
-            <w:r>
-              <w:rPr>
-                <w:rtl w:val="0"/>
-              </w:rPr>
-            </w:r>
-          </w:p>
-          <w:p>
-            <w:pPr>
-              <w:spacing w:after="240" w:before="240" w:lineRule="auto"/>
-              <w:ind w:left="600" w:right="600" w:firstLine="0"/>
-              <w:rPr>
-                <w:rFonts w:ascii="Calibri" w:cs="Calibri" w:eastAsia="Calibri" w:hAnsi="Calibri"/>
-                <w:sz w:val="20"/>
-                <w:szCs w:val="20"/>
-              </w:rPr>
-            </w:pPr>
-            <w:r>
-              <w:rPr>
-                <w:rtl w:val="0"/>
-              </w:rPr>
-            </w:r>
-          </w:p>
-          <w:p>
-            <w:pPr>
-              <w:rPr>
-                <w:rFonts w:ascii="Calibri" w:cs="Calibri" w:eastAsia="Calibri" w:hAnsi="Calibri"/>
-                <w:sz w:val="24"/>
-                <w:szCs w:val="24"/>
-              </w:rPr>
-            </w:pPr>
-            <w:r>
-              <w:rPr>
-                <w:rtl w:val="0"/>
-              </w:rPr>
             </w:r>
           </w:p>
         </w:tc>

</xml_diff>